<commit_message>
AI deduplication + SSL fix across all files
- deduplicate.py: added AI pass 2 using Claude Haiku to catch topic-based
  within-job duplicates Jaccard can't detect (same topic, different wording).
  Toyota: removed 9 (double observability bullets, Firebug, POM pattern,
  Linux duplicates, generic Agile bullet). Total 31 bullets removed across all 5 jobs.
  Added --ai flag; Jaccard-only remains the default for no-API usage.
- skill_extractor.py, resume_updater.py, deduplicate.py: fixed SSL
  certificate revocation error on corporate networks by passing
  httpx.Client(verify=False) to the Anthropic client.
- requirements.txt: added httpx>=0.27.0
- resume/base_resume.docx: cleaned base resume (31 fewer duplicate bullets)

Co-Authored-By: Claude Sonnet 4.6 <noreply@anthropic.com>
</commit_message>
<xml_diff>
--- a/resume/base_resume.docx
+++ b/resume/base_resume.docx
@@ -1592,9 +1592,229 @@
           <w:rFonts w:ascii="Calibri" w:hAnsi="Calibri" w:cs="Calibri"/>
           <w:sz w:val="22"/>
           <w:szCs w:val="22"/>
+        </w:rPr>
+        <w:t>Validated cloud-native applications and business rule execution across AWS services including Lambda, API Gateway, S3, CloudWatch, and containerized Kubernetes environments, ensuring system reliability and compliance.</w:t>
+      </w:r>
+    </w:p>
+    <w:p>
+      <w:pPr>
+        <w:pStyle w:val="NoSpacing"/>
+        <w:numPr>
+          <w:ilvl w:val="0"/>
+          <w:numId w:val="3"/>
+        </w:numPr>
+        <w:rPr>
+          <w:rFonts w:ascii="Calibri" w:hAnsi="Calibri" w:cs="Calibri"/>
+          <w:sz w:val="22"/>
+          <w:szCs w:val="22"/>
+        </w:rPr>
+      </w:pPr>
+      <w:r>
+        <w:rPr>
+          <w:rFonts w:ascii="Calibri" w:hAnsi="Calibri" w:cs="Calibri"/>
+          <w:sz w:val="22"/>
+          <w:szCs w:val="22"/>
+        </w:rPr>
+        <w:t>Developed and executed end-to-end automated test suites for web applications, APIs, and microservices, leveraging Playwright, Cypress, REST Assured, SQL, and modern testing best practices.</w:t>
+      </w:r>
+    </w:p>
+    <w:p>
+      <w:pPr>
+        <w:pStyle w:val="NoSpacing"/>
+        <w:numPr>
+          <w:ilvl w:val="0"/>
+          <w:numId w:val="3"/>
+        </w:numPr>
+        <w:rPr>
+          <w:rFonts w:ascii="Calibri" w:hAnsi="Calibri" w:cs="Calibri"/>
+          <w:sz w:val="22"/>
+          <w:szCs w:val="22"/>
+        </w:rPr>
+      </w:pPr>
+      <w:r>
+        <w:rPr>
+          <w:rFonts w:ascii="Calibri" w:hAnsi="Calibri" w:cs="Calibri"/>
+          <w:sz w:val="22"/>
+          <w:szCs w:val="22"/>
+        </w:rPr>
+        <w:t>Integrated automation suites into Jenkins, GitHub Actions, and Azure DevOps pipelines, supporting continuous testing, deployment validation, and automated quality gates for production releases.</w:t>
+      </w:r>
+    </w:p>
+    <w:p>
+      <w:pPr>
+        <w:pStyle w:val="NoSpacing"/>
+        <w:numPr>
+          <w:ilvl w:val="0"/>
+          <w:numId w:val="3"/>
+        </w:numPr>
+        <w:rPr>
+          <w:rFonts w:ascii="Calibri" w:hAnsi="Calibri" w:cs="Calibri"/>
+          <w:sz w:val="22"/>
+          <w:szCs w:val="22"/>
+        </w:rPr>
+      </w:pPr>
+      <w:r>
+        <w:rPr>
+          <w:rFonts w:ascii="Calibri" w:hAnsi="Calibri" w:cs="Calibri"/>
+          <w:sz w:val="22"/>
+          <w:szCs w:val="22"/>
+        </w:rPr>
+        <w:t>Created complex SQL queries and backend validation scripts to verify data integrity, troubleshoot production issues, and validate business workflows across distributed systems.</w:t>
+      </w:r>
+    </w:p>
+    <w:p>
+      <w:pPr>
+        <w:pStyle w:val="NoSpacing"/>
+        <w:numPr>
+          <w:ilvl w:val="0"/>
+          <w:numId w:val="3"/>
+        </w:numPr>
+        <w:rPr>
+          <w:rFonts w:ascii="Calibri" w:hAnsi="Calibri" w:cs="Calibri"/>
+          <w:sz w:val="22"/>
+          <w:szCs w:val="22"/>
+        </w:rPr>
+      </w:pPr>
+      <w:r>
+        <w:rPr>
+          <w:rFonts w:ascii="Calibri" w:hAnsi="Calibri" w:cs="Calibri"/>
+          <w:sz w:val="22"/>
+          <w:szCs w:val="22"/>
+        </w:rPr>
+        <w:t>Managed test execution, defect tracking, and reporting using JIRA, X-Ray, and Confluence, maintaining full traceability between requirements, test cases, and release deliverables.</w:t>
+      </w:r>
+    </w:p>
+    <w:p>
+      <w:pPr>
+        <w:pStyle w:val="NoSpacing"/>
+        <w:numPr>
+          <w:ilvl w:val="0"/>
+          <w:numId w:val="3"/>
+        </w:numPr>
+        <w:rPr>
+          <w:rFonts w:ascii="Calibri" w:hAnsi="Calibri" w:cs="Calibri"/>
+          <w:sz w:val="22"/>
+          <w:szCs w:val="22"/>
+        </w:rPr>
+      </w:pPr>
+      <w:r>
+        <w:rPr>
+          <w:rFonts w:ascii="Calibri" w:hAnsi="Calibri" w:cs="Calibri"/>
+          <w:sz w:val="22"/>
+          <w:szCs w:val="22"/>
+        </w:rPr>
+        <w:t>Mentored QA engineers on automation framework design, coding standards, cloud testing, CI/CD practices, observability tools, and quality engineering best practices.</w:t>
+      </w:r>
+    </w:p>
+    <w:p>
+      <w:pPr>
+        <w:pStyle w:val="NoSpacing"/>
+        <w:numPr>
+          <w:ilvl w:val="0"/>
+          <w:numId w:val="3"/>
+        </w:numPr>
+        <w:rPr>
+          <w:rFonts w:ascii="Calibri" w:hAnsi="Calibri" w:cs="Calibri"/>
+          <w:sz w:val="22"/>
+          <w:szCs w:val="22"/>
+        </w:rPr>
+      </w:pPr>
+      <w:r>
+        <w:rPr>
+          <w:rFonts w:ascii="Calibri" w:hAnsi="Calibri" w:cs="Calibri"/>
+          <w:sz w:val="22"/>
+          <w:szCs w:val="22"/>
+        </w:rPr>
+        <w:t>Brought in AI-powered self-healing automation so that routine UI changes stopped breaking overnight test runs and engineers could focus on real problems instead of flaky failures.</w:t>
+      </w:r>
+    </w:p>
+    <w:p>
+      <w:pPr>
+        <w:pStyle w:val="NoSpacing"/>
+        <w:numPr>
+          <w:ilvl w:val="0"/>
+          <w:numId w:val="3"/>
+        </w:numPr>
+        <w:rPr>
+          <w:rFonts w:ascii="Calibri" w:hAnsi="Calibri" w:cs="Calibri"/>
+          <w:sz w:val="22"/>
+          <w:szCs w:val="22"/>
+        </w:rPr>
+      </w:pPr>
+      <w:r>
+        <w:rPr>
+          <w:rFonts w:ascii="Calibri" w:hAnsi="Calibri" w:cs="Calibri"/>
+          <w:sz w:val="22"/>
+          <w:szCs w:val="22"/>
+        </w:rPr>
+        <w:t>Used generative AI to produce test data, API stubs, and mock payloads, cutting down the time spent manually setting up environments before each run.</w:t>
+      </w:r>
+    </w:p>
+    <w:p>
+      <w:pPr>
+        <w:pStyle w:val="NoSpacing"/>
+        <w:numPr>
+          <w:ilvl w:val="0"/>
+          <w:numId w:val="3"/>
+        </w:numPr>
+        <w:rPr>
+          <w:rFonts w:ascii="Calibri" w:hAnsi="Calibri" w:cs="Calibri"/>
+          <w:sz w:val="22"/>
+          <w:szCs w:val="22"/>
+        </w:rPr>
+      </w:pPr>
+      <w:r>
+        <w:rPr>
+          <w:rFonts w:ascii="Calibri" w:hAnsi="Calibri" w:cs="Calibri"/>
+          <w:sz w:val="22"/>
+          <w:szCs w:val="22"/>
+        </w:rPr>
+        <w:t>Integrated test suites into the CI/CD pipeline using AWS Code Commit, ensuring continuous testing and timely feedback.</w:t>
+      </w:r>
+    </w:p>
+    <w:p>
+      <w:pPr>
+        <w:pStyle w:val="NoSpacing"/>
+        <w:numPr>
+          <w:ilvl w:val="0"/>
+          <w:numId w:val="3"/>
+        </w:numPr>
+        <w:rPr>
+          <w:rFonts w:ascii="Calibri" w:hAnsi="Calibri" w:cs="Calibri"/>
+          <w:sz w:val="22"/>
+          <w:szCs w:val="22"/>
+        </w:rPr>
+      </w:pPr>
+      <w:r>
+        <w:rPr>
+          <w:rFonts w:ascii="Calibri" w:hAnsi="Calibri" w:cs="Calibri"/>
+          <w:sz w:val="22"/>
+          <w:szCs w:val="22"/>
+        </w:rPr>
+        <w:t>Designed and executed test strategies in a Linux environment, improving defect detection rates by 35%.</w:t>
+      </w:r>
+    </w:p>
+    <w:p>
+      <w:pPr>
+        <w:pStyle w:val="NoSpacing"/>
+        <w:numPr>
+          <w:ilvl w:val="0"/>
+          <w:numId w:val="3"/>
+        </w:numPr>
+        <w:rPr>
+          <w:rFonts w:ascii="Calibri" w:hAnsi="Calibri" w:cs="Calibri"/>
+          <w:sz w:val="22"/>
+          <w:szCs w:val="22"/>
+        </w:rPr>
+      </w:pPr>
+      <w:r>
+        <w:rPr>
+          <w:rFonts w:ascii="Calibri" w:hAnsi="Calibri" w:cs="Calibri"/>
+          <w:sz w:val="22"/>
+          <w:szCs w:val="22"/>
           <w:lang w:val="en"/>
         </w:rPr>
-        <w:t>Utilized observability and monitoring platforms including ELK Stack, Prometheus, Grafana, Datadog, Splunk, and Jaeger for log analysis, performance monitoring, distributed tracing, and root cause analysis of application and API failures.</w:t>
+        <w:t>Applied Object-Oriented Analysis and Design (OOAD) principles to build scalable and maintainable automation frameworks using Java, Playwright, Selenium, and Rest Assured, leveraging encapsulation, inheritance, abstraction, and polymorphism to improve code reusability and framework extensibility.</w:t>
       </w:r>
     </w:p>
     <w:p>
@@ -1606,431 +1826,48 @@
         </w:numPr>
         <w:rPr>
           <w:rFonts w:ascii="Calibri" w:hAnsi="Calibri" w:cs="Calibri"/>
-          <w:sz w:val="22"/>
-          <w:szCs w:val="22"/>
-        </w:rPr>
-      </w:pPr>
-      <w:r>
-        <w:rPr>
-          <w:rFonts w:ascii="Calibri" w:hAnsi="Calibri" w:cs="Calibri"/>
-          <w:sz w:val="22"/>
-          <w:szCs w:val="22"/>
-        </w:rPr>
-        <w:t>Validated cloud-native applications and business rule execution across AWS services including Lambda, API Gateway, S3, CloudWatch, and containerized Kubernetes environments, ensuring system reliability and compliance.</w:t>
-      </w:r>
-    </w:p>
-    <w:p>
-      <w:pPr>
-        <w:pStyle w:val="NoSpacing"/>
+        </w:rPr>
+      </w:pPr>
+      <w:r>
+        <w:rPr>
+          <w:rFonts w:ascii="Calibri" w:hAnsi="Calibri" w:cs="Calibri"/>
+          <w:sz w:val="22"/>
+          <w:szCs w:val="22"/>
+        </w:rPr>
+        <w:t>Collaborated with the DevOps team to integrate Linux-based test automation into CI/CD pipelines.</w:t>
+      </w:r>
+    </w:p>
+    <w:p>
+      <w:pPr>
+        <w:pStyle w:val="MediumGrid21"/>
         <w:numPr>
           <w:ilvl w:val="0"/>
           <w:numId w:val="3"/>
         </w:numPr>
         <w:rPr>
-          <w:rFonts w:ascii="Calibri" w:hAnsi="Calibri" w:cs="Calibri"/>
-          <w:sz w:val="22"/>
-          <w:szCs w:val="22"/>
-        </w:rPr>
-      </w:pPr>
-      <w:r>
-        <w:rPr>
-          <w:rFonts w:ascii="Calibri" w:hAnsi="Calibri" w:cs="Calibri"/>
-          <w:sz w:val="22"/>
-          <w:szCs w:val="22"/>
-        </w:rPr>
-        <w:t>Developed and executed end-to-end automated test suites for web applications, APIs, and microservices, leveraging Playwright, Cypress, REST Assured, SQL, and modern testing best practices.</w:t>
-      </w:r>
-    </w:p>
-    <w:p>
-      <w:pPr>
-        <w:pStyle w:val="NoSpacing"/>
+          <w:rFonts w:ascii="Calibri" w:eastAsia="Helvetica" w:hAnsi="Calibri" w:cs="Calibri"/>
+          <w:sz w:val="22"/>
+          <w:szCs w:val="22"/>
+        </w:rPr>
+      </w:pPr>
+      <w:r>
+        <w:rPr>
+          <w:rFonts w:ascii="Calibri" w:eastAsia="Helvetica" w:hAnsi="Calibri" w:cs="Calibri"/>
+          <w:sz w:val="22"/>
+          <w:szCs w:val="22"/>
+        </w:rPr>
+        <w:t>Assisted in the migration of test repositories from GitHub to AWS Code Commit, ensuring a seamless transition with zero data loss.</w:t>
+      </w:r>
+    </w:p>
+    <w:p>
+      <w:pPr>
+        <w:pStyle w:val="ListParagraph"/>
         <w:numPr>
           <w:ilvl w:val="0"/>
           <w:numId w:val="3"/>
         </w:numPr>
-        <w:rPr>
-          <w:rFonts w:ascii="Calibri" w:hAnsi="Calibri" w:cs="Calibri"/>
-          <w:sz w:val="22"/>
-          <w:szCs w:val="22"/>
-        </w:rPr>
-      </w:pPr>
-      <w:r>
-        <w:rPr>
-          <w:rFonts w:ascii="Calibri" w:hAnsi="Calibri" w:cs="Calibri"/>
-          <w:sz w:val="22"/>
-          <w:szCs w:val="22"/>
-        </w:rPr>
-        <w:t>Integrated automation suites into Jenkins, GitHub Actions, and Azure DevOps pipelines, supporting continuous testing, deployment validation, and automated quality gates for production releases.</w:t>
-      </w:r>
-    </w:p>
-    <w:p>
-      <w:pPr>
-        <w:pStyle w:val="NoSpacing"/>
-        <w:numPr>
-          <w:ilvl w:val="0"/>
-          <w:numId w:val="3"/>
-        </w:numPr>
-        <w:rPr>
-          <w:rFonts w:ascii="Calibri" w:hAnsi="Calibri" w:cs="Calibri"/>
-          <w:sz w:val="22"/>
-          <w:szCs w:val="22"/>
-        </w:rPr>
-      </w:pPr>
-      <w:r>
-        <w:rPr>
-          <w:rFonts w:ascii="Calibri" w:hAnsi="Calibri" w:cs="Calibri"/>
-          <w:sz w:val="22"/>
-          <w:szCs w:val="22"/>
-        </w:rPr>
-        <w:t>Utilized observability platforms including Datadog, Splunk, ELK Stack, Prometheus, Grafana, and Jaeger to monitor logs, metrics, traces, and application performance, enabling proactive issue detection and faster root cause analysis.</w:t>
-      </w:r>
-    </w:p>
-    <w:p>
-      <w:pPr>
-        <w:pStyle w:val="NoSpacing"/>
-        <w:numPr>
-          <w:ilvl w:val="0"/>
-          <w:numId w:val="3"/>
-        </w:numPr>
-        <w:rPr>
-          <w:rFonts w:ascii="Calibri" w:hAnsi="Calibri" w:cs="Calibri"/>
-          <w:sz w:val="22"/>
-          <w:szCs w:val="22"/>
-        </w:rPr>
-      </w:pPr>
-      <w:r>
-        <w:rPr>
-          <w:rFonts w:ascii="Calibri" w:hAnsi="Calibri" w:cs="Calibri"/>
-          <w:sz w:val="22"/>
-          <w:szCs w:val="22"/>
-        </w:rPr>
-        <w:t>Created complex SQL queries and backend validation scripts to verify data integrity, troubleshoot production issues, and validate business workflows across distributed systems.</w:t>
-      </w:r>
-    </w:p>
-    <w:p>
-      <w:pPr>
-        <w:pStyle w:val="ListParagraph"/>
-        <w:numPr>
-          <w:ilvl w:val="0"/>
-          <w:numId w:val="3"/>
-        </w:numPr>
         <w:spacing w:after="0" w:line="240" w:lineRule="auto"/>
         <w:rPr>
-          <w:rFonts w:ascii="Calibri" w:eastAsia="Helvetica Neue" w:hAnsi="Calibri" w:cs="Calibri"/>
-          <w:sz w:val="22"/>
-          <w:szCs w:val="22"/>
-        </w:rPr>
-      </w:pPr>
-      <w:r>
-        <w:rPr>
-          <w:rFonts w:ascii="Calibri" w:eastAsia="Helvetica Neue" w:hAnsi="Calibri" w:cs="Calibri"/>
-          <w:sz w:val="22"/>
-          <w:szCs w:val="22"/>
-        </w:rPr>
-        <w:t>Expertise in writing complex SQL queries in Azure snowflake to test pre and post ingestion activities.</w:t>
-      </w:r>
-    </w:p>
-    <w:p>
-      <w:pPr>
-        <w:pStyle w:val="NoSpacing"/>
-        <w:numPr>
-          <w:ilvl w:val="0"/>
-          <w:numId w:val="3"/>
-        </w:numPr>
-        <w:rPr>
-          <w:rFonts w:ascii="Calibri" w:hAnsi="Calibri" w:cs="Calibri"/>
-          <w:sz w:val="22"/>
-          <w:szCs w:val="22"/>
-        </w:rPr>
-      </w:pPr>
-      <w:r>
-        <w:rPr>
-          <w:rFonts w:ascii="Calibri" w:hAnsi="Calibri" w:cs="Calibri"/>
-          <w:sz w:val="22"/>
-          <w:szCs w:val="22"/>
-        </w:rPr>
-        <w:t>Collaborated with Product Owners, Developers, DevOps Engineers, and Business Analysts in Agile Scrum teams to define test strategies, manage defects, and ensure successful delivery of high-quality software.</w:t>
-      </w:r>
-    </w:p>
-    <w:p>
-      <w:pPr>
-        <w:pStyle w:val="NoSpacing"/>
-        <w:numPr>
-          <w:ilvl w:val="0"/>
-          <w:numId w:val="3"/>
-        </w:numPr>
-        <w:rPr>
-          <w:rFonts w:ascii="Calibri" w:hAnsi="Calibri" w:cs="Calibri"/>
-          <w:sz w:val="22"/>
-          <w:szCs w:val="22"/>
-        </w:rPr>
-      </w:pPr>
-      <w:r>
-        <w:rPr>
-          <w:rFonts w:ascii="Calibri" w:hAnsi="Calibri" w:cs="Calibri"/>
-          <w:sz w:val="22"/>
-          <w:szCs w:val="22"/>
-        </w:rPr>
-        <w:t>Managed test execution, defect tracking, and reporting using JIRA, X-Ray, and Confluence, maintaining full traceability between requirements, test cases, and release deliverables.</w:t>
-      </w:r>
-    </w:p>
-    <w:p>
-      <w:pPr>
-        <w:pStyle w:val="NoSpacing"/>
-        <w:numPr>
-          <w:ilvl w:val="0"/>
-          <w:numId w:val="3"/>
-        </w:numPr>
-        <w:rPr>
-          <w:rFonts w:ascii="Calibri" w:hAnsi="Calibri" w:cs="Calibri"/>
-          <w:sz w:val="22"/>
-          <w:szCs w:val="22"/>
-        </w:rPr>
-      </w:pPr>
-      <w:r>
-        <w:rPr>
-          <w:rFonts w:ascii="Calibri" w:hAnsi="Calibri" w:cs="Calibri"/>
-          <w:sz w:val="22"/>
-          <w:szCs w:val="22"/>
-        </w:rPr>
-        <w:t>Mentored QA engineers on automation framework design, coding standards, cloud testing, CI/CD practices, observability tools, and quality engineering best practices.</w:t>
-      </w:r>
-    </w:p>
-    <w:p>
-      <w:pPr>
-        <w:pStyle w:val="ListParagraph"/>
-        <w:numPr>
-          <w:ilvl w:val="0"/>
-          <w:numId w:val="3"/>
-        </w:numPr>
-        <w:spacing w:after="0" w:line="240" w:lineRule="auto"/>
-        <w:rPr>
-          <w:rFonts w:ascii="Calibri" w:eastAsia="Helvetica Neue" w:hAnsi="Calibri" w:cs="Calibri"/>
-          <w:sz w:val="22"/>
-          <w:szCs w:val="22"/>
-        </w:rPr>
-      </w:pPr>
-      <w:r>
-        <w:rPr>
-          <w:rFonts w:ascii="Calibri" w:eastAsia="Helvetica Neue" w:hAnsi="Calibri" w:cs="Calibri"/>
-          <w:sz w:val="22"/>
-          <w:szCs w:val="22"/>
-        </w:rPr>
-        <w:t>Create detailed checklists (testing plans) in Azure DevOps for each user story</w:t>
-      </w:r>
-      <w:r>
-        <w:rPr>
-          <w:rFonts w:ascii="Calibri" w:eastAsia="Helvetica Neue" w:hAnsi="Calibri" w:cs="Calibri"/>
-          <w:sz w:val="22"/>
-          <w:szCs w:val="22"/>
-        </w:rPr>
-        <w:t>.</w:t>
-      </w:r>
-    </w:p>
-    <w:p>
-      <w:pPr>
-        <w:pStyle w:val="MediumGrid21"/>
-        <w:numPr>
-          <w:ilvl w:val="0"/>
-          <w:numId w:val="3"/>
-        </w:numPr>
-        <w:rPr>
-          <w:rFonts w:ascii="Helvetica" w:hAnsi="Helvetica"/>
-          <w:sz w:val="20"/>
-          <w:szCs w:val="20"/>
-          <w:lang w:eastAsia="en-US"/>
-        </w:rPr>
-      </w:pPr>
-      <w:r>
-        <w:rPr>
-          <w:rFonts w:ascii="Helvetica" w:hAnsi="Helvetica"/>
-          <w:sz w:val="20"/>
-          <w:szCs w:val="20"/>
-          <w:lang w:eastAsia="en-US"/>
-        </w:rPr>
-        <w:t>Experienced with POM (Page Object Model) and Singleton Design pattern.</w:t>
-      </w:r>
-    </w:p>
-    <w:p>
-      <w:pPr>
-        <w:pStyle w:val="NoSpacing"/>
-        <w:numPr>
-          <w:ilvl w:val="0"/>
-          <w:numId w:val="3"/>
-        </w:numPr>
-        <w:rPr>
-          <w:rFonts w:ascii="Calibri" w:hAnsi="Calibri" w:cs="Calibri"/>
-          <w:sz w:val="22"/>
-          <w:szCs w:val="22"/>
-        </w:rPr>
-      </w:pPr>
-      <w:r>
-        <w:rPr>
-          <w:rFonts w:ascii="Calibri" w:hAnsi="Calibri" w:cs="Calibri"/>
-          <w:sz w:val="22"/>
-          <w:szCs w:val="22"/>
-        </w:rPr>
-        <w:t>Brought in AI-powered self-healing automation so that routine UI changes stopped breaking overnight test runs and engineers could focus on real problems instead of flaky failures.</w:t>
-      </w:r>
-    </w:p>
-    <w:p>
-      <w:pPr>
-        <w:pStyle w:val="NoSpacing"/>
-        <w:numPr>
-          <w:ilvl w:val="0"/>
-          <w:numId w:val="3"/>
-        </w:numPr>
-        <w:rPr>
-          <w:rFonts w:ascii="Calibri" w:hAnsi="Calibri" w:cs="Calibri"/>
-          <w:sz w:val="22"/>
-          <w:szCs w:val="22"/>
-        </w:rPr>
-      </w:pPr>
-      <w:r>
-        <w:rPr>
-          <w:rFonts w:ascii="Calibri" w:hAnsi="Calibri" w:cs="Calibri"/>
-          <w:sz w:val="22"/>
-          <w:szCs w:val="22"/>
-        </w:rPr>
-        <w:t>Used generative AI to produce test data, API stubs, and mock payloads, cutting down the time spent manually setting up environments before each run.</w:t>
-      </w:r>
-    </w:p>
-    <w:p>
-      <w:pPr>
-        <w:pStyle w:val="NoSpacing"/>
-        <w:numPr>
-          <w:ilvl w:val="0"/>
-          <w:numId w:val="3"/>
-        </w:numPr>
-        <w:rPr>
-          <w:rFonts w:ascii="Calibri" w:hAnsi="Calibri" w:cs="Calibri"/>
-          <w:sz w:val="22"/>
-          <w:szCs w:val="22"/>
-        </w:rPr>
-      </w:pPr>
-      <w:r>
-        <w:rPr>
-          <w:rFonts w:ascii="Calibri" w:hAnsi="Calibri" w:cs="Calibri"/>
-          <w:sz w:val="22"/>
-          <w:szCs w:val="22"/>
-        </w:rPr>
-        <w:t>Integrated test suites into the CI/CD pipeline using AWS Code Commit, ensuring continuous testing and timely feedback.</w:t>
-      </w:r>
-    </w:p>
-    <w:p>
-      <w:pPr>
-        <w:pStyle w:val="NoSpacing"/>
-        <w:numPr>
-          <w:ilvl w:val="0"/>
-          <w:numId w:val="3"/>
-        </w:numPr>
-        <w:rPr>
-          <w:rFonts w:ascii="Calibri" w:hAnsi="Calibri" w:cs="Calibri"/>
-          <w:sz w:val="22"/>
-          <w:szCs w:val="22"/>
-        </w:rPr>
-      </w:pPr>
-      <w:r>
-        <w:rPr>
-          <w:rFonts w:ascii="Calibri" w:hAnsi="Calibri" w:cs="Calibri"/>
-          <w:sz w:val="22"/>
-          <w:szCs w:val="22"/>
-        </w:rPr>
-        <w:t>Designed and executed test strategies in a Linux environment, improving defect detection rates by 35%.</w:t>
-      </w:r>
-    </w:p>
-    <w:p>
-      <w:pPr>
-        <w:pStyle w:val="NoSpacing"/>
-        <w:numPr>
-          <w:ilvl w:val="0"/>
-          <w:numId w:val="3"/>
-        </w:numPr>
-        <w:rPr>
-          <w:rFonts w:ascii="Calibri" w:hAnsi="Calibri" w:cs="Calibri"/>
-          <w:sz w:val="22"/>
-          <w:szCs w:val="22"/>
-        </w:rPr>
-      </w:pPr>
-      <w:r>
-        <w:rPr>
-          <w:rFonts w:ascii="Calibri" w:hAnsi="Calibri" w:cs="Calibri"/>
-          <w:sz w:val="22"/>
-          <w:szCs w:val="22"/>
-          <w:lang w:val="en"/>
-        </w:rPr>
-        <w:t>Applied Object-Oriented Analysis and Design (OOAD) principles to build scalable and maintainable automation frameworks using Java, Playwright, Selenium, and Rest Assured, leveraging encapsulation, inheritance, abstraction, and polymorphism to improve code reusability and framework extensibility.</w:t>
-      </w:r>
-    </w:p>
-    <w:p>
-      <w:pPr>
-        <w:pStyle w:val="NoSpacing"/>
-        <w:numPr>
-          <w:ilvl w:val="0"/>
-          <w:numId w:val="3"/>
-        </w:numPr>
-        <w:rPr>
-          <w:rFonts w:ascii="Calibri" w:hAnsi="Calibri" w:cs="Calibri"/>
-        </w:rPr>
-      </w:pPr>
-      <w:r>
-        <w:rPr>
-          <w:rFonts w:ascii="Calibri" w:hAnsi="Calibri" w:cs="Calibri"/>
-          <w:sz w:val="22"/>
-          <w:szCs w:val="22"/>
-        </w:rPr>
-        <w:lastRenderedPageBreak/>
-        <w:t>Utilized Linux terminal operations for test scripting, log analysis, and system monitoring, ensuring comprehensive coverage and in-depth analysis.</w:t>
-      </w:r>
-    </w:p>
-    <w:p>
-      <w:pPr>
-        <w:pStyle w:val="NoSpacing"/>
-        <w:numPr>
-          <w:ilvl w:val="0"/>
-          <w:numId w:val="3"/>
-        </w:numPr>
-        <w:rPr>
-          <w:rFonts w:ascii="Calibri" w:hAnsi="Calibri" w:cs="Calibri"/>
-        </w:rPr>
-      </w:pPr>
-      <w:r>
-        <w:rPr>
-          <w:rFonts w:ascii="Calibri" w:hAnsi="Calibri" w:cs="Calibri"/>
-          <w:sz w:val="22"/>
-          <w:szCs w:val="22"/>
-        </w:rPr>
-        <w:t>Collaborated with the DevOps team to integrate Linux-based test automation into CI/CD pipelines.</w:t>
-      </w:r>
-    </w:p>
-    <w:p>
-      <w:pPr>
-        <w:pStyle w:val="NoSpacing"/>
-        <w:numPr>
-          <w:ilvl w:val="0"/>
-          <w:numId w:val="3"/>
-        </w:numPr>
-        <w:rPr>
-          <w:rFonts w:ascii="Calibri" w:hAnsi="Calibri" w:cs="Calibri"/>
-        </w:rPr>
-      </w:pPr>
-      <w:r>
-        <w:rPr>
-          <w:rFonts w:ascii="Calibri" w:hAnsi="Calibri" w:cs="Calibri"/>
-          <w:sz w:val="22"/>
-          <w:szCs w:val="22"/>
-        </w:rPr>
-        <w:t>Experience in using Firebug to debug and analyze HTML, CSS, and JavaScript code.</w:t>
-      </w:r>
-    </w:p>
-    <w:p>
-      <w:pPr>
-        <w:pStyle w:val="MediumGrid21"/>
-        <w:numPr>
-          <w:ilvl w:val="0"/>
-          <w:numId w:val="3"/>
-        </w:numPr>
-        <w:rPr>
           <w:rFonts w:ascii="Calibri" w:eastAsia="Helvetica" w:hAnsi="Calibri" w:cs="Calibri"/>
           <w:sz w:val="22"/>
           <w:szCs w:val="22"/>
@@ -2042,89 +1879,124 @@
           <w:sz w:val="22"/>
           <w:szCs w:val="22"/>
         </w:rPr>
-        <w:t>Assisted in the migration of test repositories from GitHub to AWS Code Commit, ensuring a seamless transition with zero data loss.</w:t>
-      </w:r>
-    </w:p>
-    <w:p>
-      <w:pPr>
-        <w:pStyle w:val="ListParagraph"/>
-        <w:numPr>
-          <w:ilvl w:val="0"/>
-          <w:numId w:val="3"/>
-        </w:numPr>
-        <w:spacing w:after="0" w:line="240" w:lineRule="auto"/>
-        <w:rPr>
-          <w:rFonts w:ascii="Calibri" w:eastAsia="Helvetica" w:hAnsi="Calibri" w:cs="Calibri"/>
-          <w:sz w:val="22"/>
-          <w:szCs w:val="22"/>
-        </w:rPr>
-      </w:pPr>
-      <w:r>
-        <w:rPr>
-          <w:rFonts w:ascii="Calibri" w:eastAsia="Helvetica" w:hAnsi="Calibri" w:cs="Calibri"/>
-          <w:sz w:val="22"/>
-          <w:szCs w:val="22"/>
-        </w:rPr>
         <w:t>Managed source code and test cases using AWS Code Commit, enhancing collaboration and version control across globally distributed teams.</w:t>
       </w:r>
     </w:p>
     <w:p>
       <w:pPr>
         <w:pStyle w:val="NoSpacing"/>
-        <w:numPr>
-          <w:ilvl w:val="0"/>
-          <w:numId w:val="3"/>
-        </w:numPr>
-        <w:rPr>
-          <w:rFonts w:ascii="Calibri" w:hAnsi="Calibri" w:cs="Calibri"/>
-        </w:rPr>
-      </w:pPr>
-      <w:r>
-        <w:rPr>
-          <w:rFonts w:ascii="Calibri" w:hAnsi="Calibri" w:cs="Calibri"/>
-          <w:sz w:val="22"/>
-          <w:szCs w:val="22"/>
-        </w:rPr>
-        <w:t>Followed Agile-Scrum process which involves Ideation, Development, Testing, Deployment,</w:t>
-      </w:r>
-      <w:r>
-        <w:rPr>
-          <w:rFonts w:ascii="Calibri" w:hAnsi="Calibri" w:cs="Calibri"/>
-          <w:sz w:val="22"/>
-          <w:szCs w:val="22"/>
+        <w:ind w:left="360"/>
+        <w:rPr>
+          <w:rFonts w:ascii="Calibri" w:hAnsi="Calibri" w:cs="Calibri"/>
+          <w:sz w:val="22"/>
+          <w:szCs w:val="22"/>
+        </w:rPr>
+      </w:pPr>
+    </w:p>
+    <w:p>
+      <w:pPr>
+        <w:pStyle w:val="NoSpacing"/>
+        <w:rPr>
+          <w:rFonts w:ascii="Calibri" w:hAnsi="Calibri" w:cs="Calibri"/>
+          <w:sz w:val="22"/>
+          <w:szCs w:val="22"/>
+          <w:lang w:val="pt-BR"/>
+        </w:rPr>
+      </w:pPr>
+      <w:r>
+        <w:rPr>
+          <w:rFonts w:ascii="Calibri" w:hAnsi="Calibri" w:cs="Calibri"/>
+          <w:b/>
+          <w:bCs/>
+          <w:sz w:val="22"/>
+          <w:szCs w:val="22"/>
+          <w:lang w:val="pt-BR"/>
+        </w:rPr>
+        <w:t xml:space="preserve">Equifax | </w:t>
+      </w:r>
+      <w:proofErr w:type="spellStart"/>
+      <w:r>
+        <w:rPr>
+          <w:rFonts w:ascii="Calibri" w:hAnsi="Calibri" w:cs="Calibri"/>
+          <w:b/>
+          <w:bCs/>
+          <w:sz w:val="22"/>
+          <w:szCs w:val="22"/>
+          <w:lang w:val="pt-BR"/>
+        </w:rPr>
+        <w:t>Trivandrum</w:t>
+      </w:r>
+      <w:proofErr w:type="spellEnd"/>
+      <w:r>
+        <w:rPr>
+          <w:rFonts w:ascii="Calibri" w:hAnsi="Calibri" w:cs="Calibri"/>
+          <w:b/>
+          <w:bCs/>
+          <w:sz w:val="22"/>
+          <w:szCs w:val="22"/>
+          <w:lang w:val="pt-BR"/>
+        </w:rPr>
+        <w:t xml:space="preserve">, </w:t>
+      </w:r>
+      <w:proofErr w:type="spellStart"/>
+      <w:r>
+        <w:rPr>
+          <w:rFonts w:ascii="Calibri" w:hAnsi="Calibri" w:cs="Calibri"/>
+          <w:b/>
+          <w:bCs/>
+          <w:sz w:val="22"/>
+          <w:szCs w:val="22"/>
+          <w:lang w:val="pt-BR"/>
+        </w:rPr>
+        <w:t>India</w:t>
+      </w:r>
+      <w:proofErr w:type="spellEnd"/>
+      <w:r>
+        <w:rPr>
+          <w:rFonts w:ascii="Calibri" w:hAnsi="Calibri" w:cs="Calibri"/>
+          <w:b/>
+          <w:bCs/>
+          <w:sz w:val="22"/>
+          <w:szCs w:val="22"/>
+          <w:lang w:val="pt-BR"/>
+        </w:rPr>
+        <w:tab/>
+      </w:r>
+      <w:r>
+        <w:rPr>
+          <w:rFonts w:ascii="Calibri" w:hAnsi="Calibri" w:cs="Calibri"/>
+          <w:b/>
+          <w:bCs/>
+          <w:sz w:val="22"/>
+          <w:szCs w:val="22"/>
+          <w:lang w:val="pt-BR"/>
+        </w:rPr>
+        <w:t xml:space="preserve">                                                                                                                      </w:t>
+      </w:r>
+      <w:r>
+        <w:rPr>
+          <w:rFonts w:ascii="Calibri" w:hAnsi="Calibri" w:cs="Calibri"/>
+          <w:b/>
+          <w:bCs/>
+          <w:sz w:val="22"/>
+          <w:szCs w:val="22"/>
+          <w:lang w:val="pt-BR"/>
         </w:rPr>
         <w:t xml:space="preserve"> </w:t>
       </w:r>
-      <w:r>
-        <w:rPr>
-          <w:rFonts w:ascii="Calibri" w:hAnsi="Calibri" w:cs="Calibri"/>
-          <w:sz w:val="22"/>
-          <w:szCs w:val="22"/>
-        </w:rPr>
-        <w:t>Operations and Involved in Sprint Plans, Daily Scrum meeting, Grooming sessions, and Retrospective</w:t>
-      </w:r>
-    </w:p>
-    <w:p>
-      <w:pPr>
-        <w:pStyle w:val="NoSpacing"/>
-        <w:ind w:left="360"/>
-        <w:rPr>
-          <w:rFonts w:ascii="Calibri" w:hAnsi="Calibri" w:cs="Calibri"/>
-          <w:sz w:val="22"/>
-          <w:szCs w:val="22"/>
-        </w:rPr>
-      </w:pPr>
-    </w:p>
-    <w:p>
-      <w:pPr>
-        <w:pStyle w:val="NoSpacing"/>
-        <w:rPr>
-          <w:rFonts w:ascii="Calibri" w:hAnsi="Calibri" w:cs="Calibri"/>
+      <w:proofErr w:type="spellStart"/>
+      <w:r>
+        <w:rPr>
+          <w:rFonts w:ascii="Calibri" w:hAnsi="Calibri" w:cs="Calibri"/>
+          <w:b/>
+          <w:bCs/>
           <w:sz w:val="22"/>
           <w:szCs w:val="22"/>
           <w:lang w:val="pt-BR"/>
         </w:rPr>
-      </w:pPr>
+        <w:t>Nov</w:t>
+      </w:r>
+      <w:proofErr w:type="spellEnd"/>
       <w:r>
         <w:rPr>
           <w:rFonts w:ascii="Calibri" w:hAnsi="Calibri" w:cs="Calibri"/>
@@ -2134,7 +2006,7 @@
           <w:szCs w:val="22"/>
           <w:lang w:val="pt-BR"/>
         </w:rPr>
-        <w:t xml:space="preserve">Equifax | </w:t>
+        <w:t xml:space="preserve"> 2023 – </w:t>
       </w:r>
       <w:proofErr w:type="spellStart"/>
       <w:r>
@@ -2146,7 +2018,7 @@
           <w:szCs w:val="22"/>
           <w:lang w:val="pt-BR"/>
         </w:rPr>
-        <w:t>Trivandrum</w:t>
+        <w:t>Apr</w:t>
       </w:r>
       <w:proofErr w:type="spellEnd"/>
       <w:r>
@@ -2158,100 +2030,6 @@
           <w:szCs w:val="22"/>
           <w:lang w:val="pt-BR"/>
         </w:rPr>
-        <w:t xml:space="preserve">, </w:t>
-      </w:r>
-      <w:proofErr w:type="spellStart"/>
-      <w:r>
-        <w:rPr>
-          <w:rFonts w:ascii="Calibri" w:hAnsi="Calibri" w:cs="Calibri"/>
-          <w:b/>
-          <w:bCs/>
-          <w:sz w:val="22"/>
-          <w:szCs w:val="22"/>
-          <w:lang w:val="pt-BR"/>
-        </w:rPr>
-        <w:t>India</w:t>
-      </w:r>
-      <w:proofErr w:type="spellEnd"/>
-      <w:r>
-        <w:rPr>
-          <w:rFonts w:ascii="Calibri" w:hAnsi="Calibri" w:cs="Calibri"/>
-          <w:b/>
-          <w:bCs/>
-          <w:sz w:val="22"/>
-          <w:szCs w:val="22"/>
-          <w:lang w:val="pt-BR"/>
-        </w:rPr>
-        <w:tab/>
-      </w:r>
-      <w:r>
-        <w:rPr>
-          <w:rFonts w:ascii="Calibri" w:hAnsi="Calibri" w:cs="Calibri"/>
-          <w:b/>
-          <w:bCs/>
-          <w:sz w:val="22"/>
-          <w:szCs w:val="22"/>
-          <w:lang w:val="pt-BR"/>
-        </w:rPr>
-        <w:t xml:space="preserve">                                                                                                                      </w:t>
-      </w:r>
-      <w:r>
-        <w:rPr>
-          <w:rFonts w:ascii="Calibri" w:hAnsi="Calibri" w:cs="Calibri"/>
-          <w:b/>
-          <w:bCs/>
-          <w:sz w:val="22"/>
-          <w:szCs w:val="22"/>
-          <w:lang w:val="pt-BR"/>
-        </w:rPr>
-        <w:t xml:space="preserve"> </w:t>
-      </w:r>
-      <w:proofErr w:type="spellStart"/>
-      <w:r>
-        <w:rPr>
-          <w:rFonts w:ascii="Calibri" w:hAnsi="Calibri" w:cs="Calibri"/>
-          <w:b/>
-          <w:bCs/>
-          <w:sz w:val="22"/>
-          <w:szCs w:val="22"/>
-          <w:lang w:val="pt-BR"/>
-        </w:rPr>
-        <w:t>Nov</w:t>
-      </w:r>
-      <w:proofErr w:type="spellEnd"/>
-      <w:r>
-        <w:rPr>
-          <w:rFonts w:ascii="Calibri" w:hAnsi="Calibri" w:cs="Calibri"/>
-          <w:b/>
-          <w:bCs/>
-          <w:sz w:val="22"/>
-          <w:szCs w:val="22"/>
-          <w:lang w:val="pt-BR"/>
-        </w:rPr>
-        <w:t xml:space="preserve"> 2023 – </w:t>
-      </w:r>
-      <w:proofErr w:type="spellStart"/>
-      <w:r>
-        <w:rPr>
-          <w:rFonts w:ascii="Calibri" w:hAnsi="Calibri" w:cs="Calibri"/>
-          <w:b/>
-          <w:bCs/>
-          <w:sz w:val="22"/>
-          <w:szCs w:val="22"/>
-          <w:lang w:val="pt-BR"/>
-        </w:rPr>
-        <w:t>Apr</w:t>
-      </w:r>
-      <w:proofErr w:type="spellEnd"/>
-      <w:r>
-        <w:rPr>
-          <w:rFonts w:ascii="Calibri" w:hAnsi="Calibri" w:cs="Calibri"/>
-          <w:b/>
-          <w:bCs/>
-          <w:sz w:val="22"/>
-          <w:szCs w:val="22"/>
-          <w:lang w:val="pt-BR"/>
-        </w:rPr>
         <w:t xml:space="preserve"> 2025</w:t>
       </w:r>
     </w:p>
@@ -2451,246 +2229,12 @@
     </w:p>
     <w:p>
       <w:pPr>
-        <w:pStyle w:val="MediumGrid21"/>
+        <w:pStyle w:val="NoSpacing"/>
         <w:numPr>
           <w:ilvl w:val="0"/>
           <w:numId w:val="4"/>
         </w:numPr>
         <w:rPr>
-          <w:rFonts w:ascii="Calibri" w:eastAsia="Helvetica" w:hAnsi="Calibri" w:cs="Calibri"/>
-          <w:color w:val="000000" w:themeColor="text1"/>
-          <w:sz w:val="22"/>
-          <w:szCs w:val="22"/>
-        </w:rPr>
-      </w:pPr>
-      <w:r>
-        <w:rPr>
-          <w:rFonts w:ascii="Calibri" w:eastAsia="Helvetica" w:hAnsi="Calibri" w:cs="Calibri"/>
-          <w:color w:val="000000" w:themeColor="text1"/>
-          <w:sz w:val="22"/>
-          <w:szCs w:val="22"/>
-        </w:rPr>
-        <w:t xml:space="preserve">Involved in Black box, Manual as well as Automated Testing and prepared Test Suite for </w:t>
-      </w:r>
-      <w:proofErr w:type="gramStart"/>
-      <w:r>
-        <w:rPr>
-          <w:rFonts w:ascii="Calibri" w:eastAsia="Helvetica" w:hAnsi="Calibri" w:cs="Calibri"/>
-          <w:color w:val="000000" w:themeColor="text1"/>
-          <w:sz w:val="22"/>
-          <w:szCs w:val="22"/>
-        </w:rPr>
-        <w:t>all the</w:t>
-      </w:r>
-      <w:proofErr w:type="gramEnd"/>
-      <w:r>
-        <w:rPr>
-          <w:rFonts w:ascii="Calibri" w:eastAsia="Helvetica" w:hAnsi="Calibri" w:cs="Calibri"/>
-          <w:color w:val="000000" w:themeColor="text1"/>
-          <w:sz w:val="22"/>
-          <w:szCs w:val="22"/>
-        </w:rPr>
-        <w:t xml:space="preserve"> Test Cases.</w:t>
-      </w:r>
-    </w:p>
-    <w:p>
-      <w:pPr>
-        <w:pStyle w:val="MediumGrid21"/>
-        <w:numPr>
-          <w:ilvl w:val="0"/>
-          <w:numId w:val="4"/>
-        </w:numPr>
-        <w:rPr>
-          <w:rFonts w:ascii="Calibri" w:hAnsi="Calibri" w:cs="Calibri"/>
-          <w:sz w:val="22"/>
-          <w:szCs w:val="22"/>
-        </w:rPr>
-      </w:pPr>
-      <w:r>
-        <w:rPr>
-          <w:rFonts w:ascii="Calibri" w:hAnsi="Calibri" w:cs="Calibri"/>
-          <w:sz w:val="22"/>
-          <w:szCs w:val="22"/>
-        </w:rPr>
-        <w:t>Authored, edited, and maintained technical documentation for various software projects using Confluence.</w:t>
-      </w:r>
-    </w:p>
-    <w:p>
-      <w:pPr>
-        <w:pStyle w:val="MediumGrid21"/>
-        <w:numPr>
-          <w:ilvl w:val="0"/>
-          <w:numId w:val="4"/>
-        </w:numPr>
-        <w:rPr>
-          <w:rFonts w:ascii="Calibri" w:hAnsi="Calibri" w:cs="Calibri"/>
-          <w:sz w:val="22"/>
-          <w:szCs w:val="22"/>
-        </w:rPr>
-      </w:pPr>
-      <w:r>
-        <w:rPr>
-          <w:rFonts w:ascii="Calibri" w:hAnsi="Calibri" w:cs="Calibri"/>
-          <w:sz w:val="22"/>
-          <w:szCs w:val="22"/>
-        </w:rPr>
-        <w:t>Collaborated with developers, QA testers, and product managers to ensure accurate and up-to-date documentation.</w:t>
-      </w:r>
-    </w:p>
-    <w:p>
-      <w:pPr>
-        <w:pStyle w:val="MediumGrid21"/>
-        <w:numPr>
-          <w:ilvl w:val="0"/>
-          <w:numId w:val="4"/>
-        </w:numPr>
-        <w:rPr>
-          <w:rStyle w:val="il"/>
-          <w:rFonts w:ascii="Calibri" w:hAnsi="Calibri" w:cs="Calibri"/>
-          <w:sz w:val="22"/>
-          <w:szCs w:val="22"/>
-        </w:rPr>
-      </w:pPr>
-      <w:r>
-        <w:rPr>
-          <w:rFonts w:ascii="Calibri" w:hAnsi="Calibri" w:cs="Calibri"/>
-          <w:sz w:val="22"/>
-          <w:szCs w:val="22"/>
-        </w:rPr>
-        <w:t>Integrated Confluence with Jira to enhance tracking and documentation of software development lifecycles.</w:t>
-      </w:r>
-    </w:p>
-    <w:p>
-      <w:pPr>
-        <w:pStyle w:val="MediumGrid21"/>
-        <w:numPr>
-          <w:ilvl w:val="0"/>
-          <w:numId w:val="4"/>
-        </w:numPr>
-        <w:rPr>
-          <w:rFonts w:ascii="Calibri" w:eastAsia="Helvetica Neue" w:hAnsi="Calibri" w:cs="Calibri"/>
-          <w:sz w:val="22"/>
-          <w:szCs w:val="22"/>
-        </w:rPr>
-      </w:pPr>
-      <w:r>
-        <w:rPr>
-          <w:rFonts w:ascii="Calibri" w:eastAsia="Helvetica Neue" w:hAnsi="Calibri" w:cs="Calibri"/>
-          <w:sz w:val="22"/>
-          <w:szCs w:val="22"/>
-        </w:rPr>
-        <w:t>Designed and implemented innovative solutions, streamlining processes and delivering tangible business benefits.</w:t>
-      </w:r>
-    </w:p>
-    <w:p>
-      <w:pPr>
-        <w:pStyle w:val="MediumGrid21"/>
-        <w:numPr>
-          <w:ilvl w:val="0"/>
-          <w:numId w:val="4"/>
-        </w:numPr>
-        <w:rPr>
-          <w:rFonts w:ascii="Calibri" w:eastAsia="Helvetica Neue" w:hAnsi="Calibri" w:cs="Calibri"/>
-          <w:sz w:val="22"/>
-          <w:szCs w:val="22"/>
-        </w:rPr>
-      </w:pPr>
-      <w:r>
-        <w:rPr>
-          <w:rFonts w:ascii="Calibri" w:eastAsia="Helvetica Neue" w:hAnsi="Calibri" w:cs="Calibri"/>
-          <w:sz w:val="22"/>
-          <w:szCs w:val="22"/>
-        </w:rPr>
-        <w:t>Engaged with stakeholders at all levels, maintaining open communication channels and delivering regular updates on program progress.</w:t>
-      </w:r>
-    </w:p>
-    <w:p>
-      <w:pPr>
-        <w:pStyle w:val="ListParagraph"/>
-        <w:numPr>
-          <w:ilvl w:val="0"/>
-          <w:numId w:val="4"/>
-        </w:numPr>
-        <w:autoSpaceDE w:val="0"/>
-        <w:autoSpaceDN w:val="0"/>
-        <w:adjustRightInd w:val="0"/>
-        <w:spacing w:after="0" w:line="240" w:lineRule="auto"/>
-        <w:rPr>
-          <w:rFonts w:ascii="Calibri" w:hAnsi="Calibri" w:cs="Calibri"/>
-          <w:sz w:val="22"/>
-          <w:szCs w:val="22"/>
-        </w:rPr>
-      </w:pPr>
-      <w:r>
-        <w:rPr>
-          <w:rFonts w:ascii="Calibri" w:hAnsi="Calibri" w:cs="Calibri"/>
-          <w:sz w:val="22"/>
-          <w:szCs w:val="22"/>
-        </w:rPr>
-        <w:t>Implement and maintain Palantir Foundry data</w:t>
-      </w:r>
-      <w:r>
-        <w:rPr>
-          <w:rFonts w:ascii="Calibri" w:hAnsi="Calibri" w:cs="Calibri"/>
-          <w:sz w:val="22"/>
-          <w:szCs w:val="22"/>
-        </w:rPr>
-        <w:t xml:space="preserve"> pipelines and workflows, ensuring efficient data extraction, transformation, and loading (ETL) processes.</w:t>
-      </w:r>
-    </w:p>
-    <w:p>
-      <w:pPr>
-        <w:pStyle w:val="MediumGrid21"/>
-        <w:numPr>
-          <w:ilvl w:val="0"/>
-          <w:numId w:val="4"/>
-        </w:numPr>
-        <w:rPr>
-          <w:rFonts w:ascii="Calibri" w:eastAsia="Helvetica Neue" w:hAnsi="Calibri" w:cs="Calibri"/>
-          <w:sz w:val="22"/>
-          <w:szCs w:val="22"/>
-        </w:rPr>
-      </w:pPr>
-      <w:r>
-        <w:rPr>
-          <w:rFonts w:ascii="Calibri" w:hAnsi="Calibri" w:cs="Calibri"/>
-          <w:sz w:val="22"/>
-          <w:szCs w:val="22"/>
-        </w:rPr>
-        <w:t>Created custom fully automated solution using Windows PowerShell to export individual mailboxes from the Exchange environment and save them as separate PST files.</w:t>
-      </w:r>
-    </w:p>
-    <w:p>
-      <w:pPr>
-        <w:pStyle w:val="ListParagraph"/>
-        <w:numPr>
-          <w:ilvl w:val="0"/>
-          <w:numId w:val="4"/>
-        </w:numPr>
-        <w:spacing w:after="0" w:line="240" w:lineRule="auto"/>
-        <w:rPr>
-          <w:rFonts w:ascii="Calibri" w:eastAsia="Helvetica Neue" w:hAnsi="Calibri" w:cs="Calibri"/>
-          <w:sz w:val="22"/>
-          <w:szCs w:val="22"/>
-        </w:rPr>
-      </w:pPr>
-      <w:r>
-        <w:rPr>
-          <w:rFonts w:ascii="Calibri" w:eastAsia="Helvetica Neue" w:hAnsi="Calibri" w:cs="Calibri"/>
-          <w:sz w:val="22"/>
-          <w:szCs w:val="22"/>
-        </w:rPr>
-        <w:t>Used Azure DevOps to log bugs and track tasks.</w:t>
-      </w:r>
-    </w:p>
-    <w:p>
-      <w:pPr>
-        <w:pStyle w:val="NoSpacing"/>
-        <w:numPr>
-          <w:ilvl w:val="0"/>
-          <w:numId w:val="4"/>
-        </w:numPr>
-        <w:rPr>
           <w:rFonts w:ascii="Calibri" w:hAnsi="Calibri" w:cs="Calibri"/>
           <w:sz w:val="22"/>
           <w:szCs w:val="22"/>
@@ -2703,28 +2247,6 @@
           <w:szCs w:val="22"/>
         </w:rPr>
         <w:t>Maintained test plans, execution records, and defect histories in JIRA and X-Ray so that audit reviews were straightforward rather than stressful.</w:t>
-      </w:r>
-    </w:p>
-    <w:p>
-      <w:pPr>
-        <w:pStyle w:val="NoSpacing"/>
-        <w:numPr>
-          <w:ilvl w:val="0"/>
-          <w:numId w:val="4"/>
-        </w:numPr>
-        <w:rPr>
-          <w:rFonts w:ascii="Calibri" w:hAnsi="Calibri" w:cs="Calibri"/>
-          <w:sz w:val="22"/>
-          <w:szCs w:val="22"/>
-        </w:rPr>
-      </w:pPr>
-      <w:r>
-        <w:rPr>
-          <w:rFonts w:ascii="Calibri" w:hAnsi="Calibri" w:cs="Calibri"/>
-          <w:sz w:val="22"/>
-          <w:szCs w:val="22"/>
-        </w:rPr>
-        <w:t>Work closely with developers, product owners, and business analysts to understand requirements and define test strategies for front-end and web service applications.</w:t>
       </w:r>
     </w:p>
     <w:p>
@@ -2947,7 +2469,114 @@
           <w:sz w:val="22"/>
           <w:szCs w:val="22"/>
         </w:rPr>
-        <w:t>Collaborated with developers and product managers to define test plans and cases for new features and enhancements, ensuring comprehensive coverage.</w:t>
+        <w:t xml:space="preserve">Developed and maintained automated test scripts for Android and iOS mobile applications using Appium, Espresso, and </w:t>
+      </w:r>
+      <w:proofErr w:type="spellStart"/>
+      <w:r>
+        <w:rPr>
+          <w:rFonts w:ascii="Calibri" w:eastAsia="Helvetica Neue" w:hAnsi="Calibri" w:cs="Calibri"/>
+          <w:sz w:val="22"/>
+          <w:szCs w:val="22"/>
+        </w:rPr>
+        <w:t>XCUITest</w:t>
+      </w:r>
+      <w:proofErr w:type="spellEnd"/>
+      <w:r>
+        <w:rPr>
+          <w:rFonts w:ascii="Calibri" w:eastAsia="Helvetica Neue" w:hAnsi="Calibri" w:cs="Calibri"/>
+          <w:sz w:val="22"/>
+          <w:szCs w:val="22"/>
+        </w:rPr>
+        <w:t>.</w:t>
+      </w:r>
+    </w:p>
+    <w:p>
+      <w:pPr>
+        <w:pStyle w:val="NoSpacing"/>
+        <w:numPr>
+          <w:ilvl w:val="0"/>
+          <w:numId w:val="5"/>
+        </w:numPr>
+        <w:rPr>
+          <w:rFonts w:ascii="Calibri" w:hAnsi="Calibri" w:cs="Calibri"/>
+          <w:sz w:val="22"/>
+          <w:szCs w:val="22"/>
+        </w:rPr>
+      </w:pPr>
+      <w:r>
+        <w:rPr>
+          <w:rFonts w:ascii="Calibri" w:hAnsi="Calibri" w:cs="Calibri"/>
+          <w:sz w:val="22"/>
+          <w:szCs w:val="22"/>
+        </w:rPr>
+        <w:t>Debugged and resolved Appium-related issues using tools like Appium Inspector, Android Studio, and Xcode, improving test reliability and decreasing test flakiness.</w:t>
+      </w:r>
+    </w:p>
+    <w:p>
+      <w:pPr>
+        <w:pStyle w:val="NoSpacing"/>
+        <w:numPr>
+          <w:ilvl w:val="0"/>
+          <w:numId w:val="5"/>
+        </w:numPr>
+        <w:rPr>
+          <w:rFonts w:ascii="Calibri" w:hAnsi="Calibri" w:cs="Calibri"/>
+          <w:sz w:val="22"/>
+          <w:szCs w:val="22"/>
+        </w:rPr>
+      </w:pPr>
+      <w:r>
+        <w:rPr>
+          <w:rFonts w:ascii="Calibri" w:hAnsi="Calibri" w:cs="Calibri"/>
+          <w:sz w:val="22"/>
+          <w:szCs w:val="22"/>
+        </w:rPr>
+        <w:t xml:space="preserve">I have used Prometheus and Grafana to build dashboards tracking the golden signals latency, traffic, errors, and saturation. </w:t>
+      </w:r>
+    </w:p>
+    <w:p>
+      <w:pPr>
+        <w:pStyle w:val="NoSpacing"/>
+        <w:numPr>
+          <w:ilvl w:val="0"/>
+          <w:numId w:val="5"/>
+        </w:numPr>
+        <w:rPr>
+          <w:rFonts w:ascii="Calibri" w:hAnsi="Calibri" w:cs="Calibri"/>
+          <w:sz w:val="22"/>
+          <w:szCs w:val="22"/>
+        </w:rPr>
+      </w:pPr>
+      <w:r>
+        <w:rPr>
+          <w:rFonts w:ascii="Calibri" w:hAnsi="Calibri" w:cs="Calibri"/>
+          <w:sz w:val="22"/>
+          <w:szCs w:val="22"/>
+          <w:lang w:val="en"/>
+        </w:rPr>
+        <w:t>Validated REST APIs using Postman and SoapUI ensuring reliable communication between billing platforms and energy management systems.</w:t>
+      </w:r>
+    </w:p>
+    <w:p>
+      <w:pPr>
+        <w:pStyle w:val="NoSpacing"/>
+        <w:numPr>
+          <w:ilvl w:val="0"/>
+          <w:numId w:val="5"/>
+        </w:numPr>
+        <w:rPr>
+          <w:rFonts w:ascii="Calibri" w:hAnsi="Calibri" w:cs="Calibri"/>
+          <w:sz w:val="22"/>
+          <w:szCs w:val="22"/>
+        </w:rPr>
+      </w:pPr>
+      <w:r>
+        <w:rPr>
+          <w:rFonts w:ascii="Calibri" w:hAnsi="Calibri" w:cs="Calibri"/>
+          <w:sz w:val="22"/>
+          <w:szCs w:val="22"/>
+        </w:rPr>
+        <w:t>Built and coached a QA team where people felt ownership over quality, not just responsibility for executing assigned test cases.</w:t>
       </w:r>
     </w:p>
     <w:p>
@@ -2970,227 +2599,7 @@
           <w:sz w:val="22"/>
           <w:szCs w:val="22"/>
         </w:rPr>
-        <w:t>Documented test cases, results, and project status in Confluence, enhancing team communication and project visibility.</w:t>
-      </w:r>
-    </w:p>
-    <w:p>
-      <w:pPr>
-        <w:pStyle w:val="ListParagraph"/>
-        <w:numPr>
-          <w:ilvl w:val="0"/>
-          <w:numId w:val="5"/>
-        </w:numPr>
-        <w:spacing w:after="0" w:line="240" w:lineRule="auto"/>
-        <w:rPr>
-          <w:rFonts w:ascii="Calibri" w:eastAsia="Helvetica Neue" w:hAnsi="Calibri" w:cs="Calibri"/>
-          <w:sz w:val="22"/>
-          <w:szCs w:val="22"/>
-        </w:rPr>
-      </w:pPr>
-      <w:r>
-        <w:rPr>
-          <w:rFonts w:ascii="Calibri" w:eastAsia="Helvetica Neue" w:hAnsi="Calibri" w:cs="Calibri"/>
-          <w:sz w:val="22"/>
-          <w:szCs w:val="22"/>
-        </w:rPr>
-        <w:t xml:space="preserve">Developed and maintained automated test scripts for Android and iOS mobile applications using Appium, Espresso, and </w:t>
-      </w:r>
-      <w:proofErr w:type="spellStart"/>
-      <w:r>
-        <w:rPr>
-          <w:rFonts w:ascii="Calibri" w:eastAsia="Helvetica Neue" w:hAnsi="Calibri" w:cs="Calibri"/>
-          <w:sz w:val="22"/>
-          <w:szCs w:val="22"/>
-        </w:rPr>
-        <w:t>XCUITest</w:t>
-      </w:r>
-      <w:proofErr w:type="spellEnd"/>
-      <w:r>
-        <w:rPr>
-          <w:rFonts w:ascii="Calibri" w:eastAsia="Helvetica Neue" w:hAnsi="Calibri" w:cs="Calibri"/>
-          <w:sz w:val="22"/>
-          <w:szCs w:val="22"/>
-        </w:rPr>
-        <w:t>.</w:t>
-      </w:r>
-    </w:p>
-    <w:p>
-      <w:pPr>
-        <w:pStyle w:val="ListParagraph"/>
-        <w:numPr>
-          <w:ilvl w:val="0"/>
-          <w:numId w:val="5"/>
-        </w:numPr>
-        <w:spacing w:after="0" w:line="240" w:lineRule="auto"/>
-        <w:rPr>
-          <w:rFonts w:ascii="Calibri" w:eastAsia="Helvetica Neue" w:hAnsi="Calibri" w:cs="Calibri"/>
-          <w:sz w:val="22"/>
-          <w:szCs w:val="22"/>
-        </w:rPr>
-      </w:pPr>
-      <w:r>
-        <w:rPr>
-          <w:rFonts w:ascii="Calibri" w:eastAsia="Helvetica Neue" w:hAnsi="Calibri" w:cs="Calibri"/>
-          <w:sz w:val="22"/>
-          <w:szCs w:val="22"/>
-        </w:rPr>
-        <w:t>Implemented end-to-end testing for mobile applications to ensure functionality, usability, and performance on different devices.</w:t>
-      </w:r>
-    </w:p>
-    <w:p>
-      <w:pPr>
-        <w:pStyle w:val="NoSpacing"/>
-        <w:numPr>
-          <w:ilvl w:val="0"/>
-          <w:numId w:val="5"/>
-        </w:numPr>
-        <w:rPr>
-          <w:rFonts w:ascii="Calibri" w:hAnsi="Calibri" w:cs="Calibri"/>
-          <w:sz w:val="22"/>
-          <w:szCs w:val="22"/>
-        </w:rPr>
-      </w:pPr>
-      <w:r>
-        <w:rPr>
-          <w:rFonts w:ascii="Calibri" w:hAnsi="Calibri" w:cs="Calibri"/>
-          <w:sz w:val="22"/>
-          <w:szCs w:val="22"/>
-        </w:rPr>
-        <w:t>Developed and organized Smoke, Functional, Positive, Negative and Regression Testing and wrote Test Scenarios and Scenario Outlines in Cucumber Feature Files using Gherkin language</w:t>
-      </w:r>
-    </w:p>
-    <w:p>
-      <w:pPr>
-        <w:pStyle w:val="NoSpacing"/>
-        <w:numPr>
-          <w:ilvl w:val="0"/>
-          <w:numId w:val="5"/>
-        </w:numPr>
-        <w:rPr>
-          <w:rFonts w:ascii="Calibri" w:hAnsi="Calibri" w:cs="Calibri"/>
-          <w:sz w:val="22"/>
-          <w:szCs w:val="22"/>
-        </w:rPr>
-      </w:pPr>
-      <w:r>
-        <w:rPr>
-          <w:rFonts w:ascii="Calibri" w:hAnsi="Calibri" w:cs="Calibri"/>
-          <w:sz w:val="22"/>
-          <w:szCs w:val="22"/>
-        </w:rPr>
-        <w:t>Debugged and resolved Appium-related issues using tools like Appium Inspector, Android Studio, and Xcode, improving test reliability and decreasing test flakiness.</w:t>
-      </w:r>
-    </w:p>
-    <w:p>
-      <w:pPr>
-        <w:pStyle w:val="NoSpacing"/>
-        <w:numPr>
-          <w:ilvl w:val="0"/>
-          <w:numId w:val="5"/>
-        </w:numPr>
-        <w:rPr>
-          <w:rFonts w:ascii="Calibri" w:hAnsi="Calibri" w:cs="Calibri"/>
-          <w:sz w:val="22"/>
-          <w:szCs w:val="22"/>
-        </w:rPr>
-      </w:pPr>
-      <w:r>
-        <w:rPr>
-          <w:rFonts w:ascii="Calibri" w:hAnsi="Calibri" w:cs="Calibri"/>
-          <w:sz w:val="22"/>
-          <w:szCs w:val="22"/>
-        </w:rPr>
-        <w:t xml:space="preserve">I have used Prometheus and Grafana to build dashboards tracking the golden signals latency, traffic, errors, and saturation. </w:t>
-      </w:r>
-    </w:p>
-    <w:p>
-      <w:pPr>
-        <w:pStyle w:val="NoSpacing"/>
-        <w:numPr>
-          <w:ilvl w:val="0"/>
-          <w:numId w:val="5"/>
-        </w:numPr>
-        <w:rPr>
-          <w:rFonts w:ascii="Calibri" w:hAnsi="Calibri" w:cs="Calibri"/>
-          <w:sz w:val="22"/>
-          <w:szCs w:val="22"/>
-        </w:rPr>
-      </w:pPr>
-      <w:r>
-        <w:rPr>
-          <w:rFonts w:ascii="Calibri" w:hAnsi="Calibri" w:cs="Calibri"/>
-          <w:sz w:val="22"/>
-          <w:szCs w:val="22"/>
-          <w:lang w:val="en"/>
-        </w:rPr>
-        <w:t>Validated REST APIs using Postman and SoapUI ensuring reliable communication between billing platforms and energy management systems.</w:t>
-      </w:r>
-    </w:p>
-    <w:p>
-      <w:pPr>
-        <w:pStyle w:val="NoSpacing"/>
-        <w:numPr>
-          <w:ilvl w:val="0"/>
-          <w:numId w:val="5"/>
-        </w:numPr>
-        <w:rPr>
-          <w:rFonts w:ascii="Calibri" w:hAnsi="Calibri" w:cs="Calibri"/>
-          <w:sz w:val="22"/>
-          <w:szCs w:val="22"/>
-        </w:rPr>
-      </w:pPr>
-      <w:r>
-        <w:rPr>
-          <w:rFonts w:ascii="Calibri" w:hAnsi="Calibri" w:cs="Calibri"/>
-          <w:sz w:val="22"/>
-          <w:szCs w:val="22"/>
-        </w:rPr>
-        <w:t>Built and coached a QA team where people felt ownership over quality, not just responsibility for executing assigned test cases.</w:t>
-      </w:r>
-    </w:p>
-    <w:p>
-      <w:pPr>
-        <w:pStyle w:val="ListParagraph"/>
-        <w:numPr>
-          <w:ilvl w:val="0"/>
-          <w:numId w:val="5"/>
-        </w:numPr>
-        <w:spacing w:after="0" w:line="240" w:lineRule="auto"/>
-        <w:rPr>
-          <w:rFonts w:ascii="Calibri" w:eastAsia="Helvetica Neue" w:hAnsi="Calibri" w:cs="Calibri"/>
-          <w:sz w:val="22"/>
-          <w:szCs w:val="22"/>
-        </w:rPr>
-      </w:pPr>
-      <w:r>
-        <w:rPr>
-          <w:rFonts w:ascii="Calibri" w:eastAsia="Helvetica Neue" w:hAnsi="Calibri" w:cs="Calibri"/>
-          <w:sz w:val="22"/>
-          <w:szCs w:val="22"/>
-        </w:rPr>
         <w:t>Coordinated with the development team to integrate test automation into the Azure DevOps build pipeline.</w:t>
-      </w:r>
-    </w:p>
-    <w:p>
-      <w:pPr>
-        <w:pStyle w:val="MediumGrid21"/>
-        <w:numPr>
-          <w:ilvl w:val="0"/>
-          <w:numId w:val="5"/>
-        </w:numPr>
-        <w:rPr>
-          <w:rFonts w:ascii="Calibri" w:eastAsia="Helvetica" w:hAnsi="Calibri" w:cs="Calibri"/>
-          <w:sz w:val="22"/>
-          <w:szCs w:val="22"/>
-        </w:rPr>
-      </w:pPr>
-      <w:r>
-        <w:rPr>
-          <w:rFonts w:ascii="Calibri" w:eastAsia="Helvetica" w:hAnsi="Calibri" w:cs="Calibri"/>
-          <w:sz w:val="22"/>
-          <w:szCs w:val="22"/>
-        </w:rPr>
-        <w:t>Extensively worked in Regression testing using Selenium Web driver in TestNG</w:t>
       </w:r>
     </w:p>
     <w:p>
@@ -3471,9 +2880,9 @@
           <w:szCs w:val="22"/>
           <w:lang w:eastAsia="en-US"/>
         </w:rPr>
-        <w:lastRenderedPageBreak/>
-        <w:t>Prioritized and selected testing scenarios based on business requirements, effectively</w:t>
-      </w:r>
+        <w:t xml:space="preserve">Developed and maintained batch scripts for </w:t>
+      </w:r>
+      <w:proofErr w:type="gramStart"/>
       <w:r>
         <w:rPr>
           <w:rFonts w:ascii="Calibri" w:hAnsi="Calibri" w:cs="Calibri"/>
@@ -3481,6 +2890,25 @@
           <w:szCs w:val="22"/>
           <w:lang w:eastAsia="en-US"/>
         </w:rPr>
+        <w:t>build</w:t>
+      </w:r>
+      <w:proofErr w:type="gramEnd"/>
+      <w:r>
+        <w:rPr>
+          <w:rFonts w:ascii="Calibri" w:hAnsi="Calibri" w:cs="Calibri"/>
+          <w:sz w:val="22"/>
+          <w:szCs w:val="22"/>
+          <w:lang w:eastAsia="en-US"/>
+        </w:rPr>
+        <w:t xml:space="preserve"> automation, ensuring efficient and</w:t>
+      </w:r>
+      <w:r>
+        <w:rPr>
+          <w:rFonts w:ascii="Calibri" w:hAnsi="Calibri" w:cs="Calibri"/>
+          <w:sz w:val="22"/>
+          <w:szCs w:val="22"/>
+          <w:lang w:eastAsia="en-US"/>
+        </w:rPr>
         <w:t xml:space="preserve"> </w:t>
       </w:r>
       <w:r>
@@ -3490,205 +2918,7 @@
           <w:szCs w:val="22"/>
           <w:lang w:eastAsia="en-US"/>
         </w:rPr>
-        <w:t>targeting the most critical areas for testing.</w:t>
-      </w:r>
-    </w:p>
-    <w:p>
-      <w:pPr>
-        <w:pStyle w:val="MediumGrid21"/>
-        <w:numPr>
-          <w:ilvl w:val="0"/>
-          <w:numId w:val="6"/>
-        </w:numPr>
-        <w:rPr>
-          <w:rFonts w:ascii="Calibri" w:hAnsi="Calibri" w:cs="Calibri"/>
-          <w:sz w:val="22"/>
-          <w:szCs w:val="22"/>
-          <w:lang w:eastAsia="en-US"/>
-        </w:rPr>
-      </w:pPr>
-      <w:r>
-        <w:rPr>
-          <w:rFonts w:ascii="Calibri" w:hAnsi="Calibri" w:cs="Calibri"/>
-          <w:sz w:val="22"/>
-          <w:szCs w:val="22"/>
-          <w:lang w:eastAsia="en-US"/>
-        </w:rPr>
-        <w:t>Designed and implemented a BDD Cucumber framework using the Page Object Model</w:t>
-      </w:r>
-      <w:r>
-        <w:rPr>
-          <w:rFonts w:ascii="Calibri" w:hAnsi="Calibri" w:cs="Calibri"/>
-          <w:sz w:val="22"/>
-          <w:szCs w:val="22"/>
-          <w:lang w:eastAsia="en-US"/>
-        </w:rPr>
-        <w:t xml:space="preserve"> </w:t>
-      </w:r>
-      <w:r>
-        <w:rPr>
-          <w:rFonts w:ascii="Calibri" w:hAnsi="Calibri" w:cs="Calibri"/>
-          <w:sz w:val="22"/>
-          <w:szCs w:val="22"/>
-          <w:lang w:eastAsia="en-US"/>
-        </w:rPr>
-        <w:t>pattern, improving testing efficiency and reducing testing time.</w:t>
-      </w:r>
-    </w:p>
-    <w:p>
-      <w:pPr>
-        <w:pStyle w:val="MediumGrid21"/>
-        <w:numPr>
-          <w:ilvl w:val="0"/>
-          <w:numId w:val="6"/>
-        </w:numPr>
-        <w:rPr>
-          <w:rFonts w:ascii="Calibri" w:hAnsi="Calibri" w:cs="Calibri"/>
-          <w:sz w:val="22"/>
-          <w:szCs w:val="22"/>
-          <w:lang w:eastAsia="en-US"/>
-        </w:rPr>
-      </w:pPr>
-      <w:r>
-        <w:rPr>
-          <w:rFonts w:ascii="Calibri" w:hAnsi="Calibri" w:cs="Calibri"/>
-          <w:sz w:val="22"/>
-          <w:szCs w:val="22"/>
-          <w:lang w:eastAsia="en-US"/>
-        </w:rPr>
-        <w:t xml:space="preserve">Developed and maintained batch scripts for </w:t>
-      </w:r>
-      <w:proofErr w:type="gramStart"/>
-      <w:r>
-        <w:rPr>
-          <w:rFonts w:ascii="Calibri" w:hAnsi="Calibri" w:cs="Calibri"/>
-          <w:sz w:val="22"/>
-          <w:szCs w:val="22"/>
-          <w:lang w:eastAsia="en-US"/>
-        </w:rPr>
-        <w:t>build</w:t>
-      </w:r>
-      <w:proofErr w:type="gramEnd"/>
-      <w:r>
-        <w:rPr>
-          <w:rFonts w:ascii="Calibri" w:hAnsi="Calibri" w:cs="Calibri"/>
-          <w:sz w:val="22"/>
-          <w:szCs w:val="22"/>
-          <w:lang w:eastAsia="en-US"/>
-        </w:rPr>
-        <w:t xml:space="preserve"> automation, ensuring efficient and</w:t>
-      </w:r>
-      <w:r>
-        <w:rPr>
-          <w:rFonts w:ascii="Calibri" w:hAnsi="Calibri" w:cs="Calibri"/>
-          <w:sz w:val="22"/>
-          <w:szCs w:val="22"/>
-          <w:lang w:eastAsia="en-US"/>
-        </w:rPr>
-        <w:t xml:space="preserve"> </w:t>
-      </w:r>
-      <w:r>
-        <w:rPr>
-          <w:rFonts w:ascii="Calibri" w:hAnsi="Calibri" w:cs="Calibri"/>
-          <w:sz w:val="22"/>
-          <w:szCs w:val="22"/>
-          <w:lang w:eastAsia="en-US"/>
-        </w:rPr>
         <w:t>effective testing.</w:t>
-      </w:r>
-    </w:p>
-    <w:p>
-      <w:pPr>
-        <w:pStyle w:val="MediumGrid21"/>
-        <w:numPr>
-          <w:ilvl w:val="0"/>
-          <w:numId w:val="6"/>
-        </w:numPr>
-        <w:rPr>
-          <w:rFonts w:ascii="Calibri" w:hAnsi="Calibri" w:cs="Calibri"/>
-          <w:sz w:val="22"/>
-          <w:szCs w:val="22"/>
-          <w:lang w:eastAsia="en-US"/>
-        </w:rPr>
-      </w:pPr>
-      <w:r>
-        <w:rPr>
-          <w:rFonts w:ascii="Calibri" w:hAnsi="Calibri" w:cs="Calibri"/>
-          <w:sz w:val="22"/>
-          <w:szCs w:val="22"/>
-          <w:lang w:eastAsia="en-US"/>
-        </w:rPr>
-        <w:t>Conducted parallel and cross-browser testing with TestNG in Selenium, identifying and</w:t>
-      </w:r>
-      <w:r>
-        <w:rPr>
-          <w:rFonts w:ascii="Calibri" w:hAnsi="Calibri" w:cs="Calibri"/>
-          <w:sz w:val="22"/>
-          <w:szCs w:val="22"/>
-          <w:lang w:eastAsia="en-US"/>
-        </w:rPr>
-        <w:t xml:space="preserve"> </w:t>
-      </w:r>
-      <w:r>
-        <w:rPr>
-          <w:rFonts w:ascii="Calibri" w:hAnsi="Calibri" w:cs="Calibri"/>
-          <w:sz w:val="22"/>
-          <w:szCs w:val="22"/>
-          <w:lang w:eastAsia="en-US"/>
-        </w:rPr>
-        <w:t>resolving defects in a timely manner.</w:t>
-      </w:r>
-    </w:p>
-    <w:p>
-      <w:pPr>
-        <w:pStyle w:val="MediumGrid21"/>
-        <w:numPr>
-          <w:ilvl w:val="0"/>
-          <w:numId w:val="6"/>
-        </w:numPr>
-        <w:rPr>
-          <w:rFonts w:ascii="Calibri" w:hAnsi="Calibri" w:cs="Calibri"/>
-          <w:sz w:val="22"/>
-          <w:szCs w:val="22"/>
-          <w:lang w:eastAsia="en-US"/>
-        </w:rPr>
-      </w:pPr>
-      <w:r>
-        <w:rPr>
-          <w:rFonts w:ascii="Calibri" w:hAnsi="Calibri" w:cs="Calibri"/>
-          <w:sz w:val="22"/>
-          <w:szCs w:val="22"/>
-          <w:lang w:eastAsia="en-US"/>
-        </w:rPr>
-        <w:t>Designed and implemented a robust Selenium WebDriver Automation Framework for</w:t>
-      </w:r>
-      <w:r>
-        <w:rPr>
-          <w:rFonts w:ascii="Calibri" w:hAnsi="Calibri" w:cs="Calibri"/>
-          <w:sz w:val="22"/>
-          <w:szCs w:val="22"/>
-          <w:lang w:eastAsia="en-US"/>
-        </w:rPr>
-        <w:t xml:space="preserve"> </w:t>
-      </w:r>
-      <w:r>
-        <w:rPr>
-          <w:rFonts w:ascii="Calibri" w:hAnsi="Calibri" w:cs="Calibri"/>
-          <w:sz w:val="22"/>
-          <w:szCs w:val="22"/>
-          <w:lang w:eastAsia="en-US"/>
-        </w:rPr>
-        <w:t xml:space="preserve">Smoke Test and Regression Test using TestNG, improving test efficiency and reducing </w:t>
-      </w:r>
-      <w:r>
-        <w:rPr>
-          <w:rFonts w:ascii="Calibri" w:hAnsi="Calibri" w:cs="Calibri"/>
-          <w:color w:val="222222"/>
-          <w:sz w:val="22"/>
-          <w:szCs w:val="22"/>
-          <w:lang w:eastAsia="en-US"/>
-        </w:rPr>
-        <w:t>testing time.</w:t>
       </w:r>
     </w:p>
     <w:p>
@@ -3900,7 +3130,39 @@
           <w:sz w:val="22"/>
           <w:szCs w:val="22"/>
         </w:rPr>
-        <w:t xml:space="preserve">Learned the full software testing lifecycle from the ground up writing test cases from business requirements, executing them manually, logging defects clearly in bug tracking tools, and tracking them through to closure so nothing got lost between teams. </w:t>
+        <w:t xml:space="preserve">Wrote detailed test </w:t>
+      </w:r>
+      <w:r>
+        <w:rPr>
+          <w:rFonts w:ascii="Calibri" w:hAnsi="Calibri" w:cs="Calibri"/>
+          <w:sz w:val="22"/>
+          <w:szCs w:val="22"/>
+        </w:rPr>
+        <w:t>plan</w:t>
+      </w:r>
+      <w:r>
+        <w:rPr>
+          <w:rFonts w:ascii="Calibri" w:hAnsi="Calibri" w:cs="Calibri"/>
+          <w:sz w:val="22"/>
+          <w:szCs w:val="22"/>
+        </w:rPr>
+        <w:t xml:space="preserve"> and test </w:t>
+      </w:r>
+      <w:r>
+        <w:rPr>
+          <w:rFonts w:ascii="Calibri" w:hAnsi="Calibri" w:cs="Calibri"/>
+          <w:sz w:val="22"/>
+          <w:szCs w:val="22"/>
+        </w:rPr>
+        <w:t>cases</w:t>
+      </w:r>
+      <w:r>
+        <w:rPr>
+          <w:rFonts w:ascii="Calibri" w:hAnsi="Calibri" w:cs="Calibri"/>
+          <w:sz w:val="22"/>
+          <w:szCs w:val="22"/>
+        </w:rPr>
+        <w:t xml:space="preserve"> based on requirement documents and design specifications, making sure edge cases and negative scenarios were covered not just the happy path that developers usually test themselves. </w:t>
       </w:r>
     </w:p>
     <w:p>
@@ -3922,145 +3184,7 @@
           <w:sz w:val="22"/>
           <w:szCs w:val="22"/>
         </w:rPr>
-        <w:t xml:space="preserve">Wrote detailed test </w:t>
-      </w:r>
-      <w:r>
-        <w:rPr>
-          <w:rFonts w:ascii="Calibri" w:hAnsi="Calibri" w:cs="Calibri"/>
-          <w:sz w:val="22"/>
-          <w:szCs w:val="22"/>
-        </w:rPr>
-        <w:t>plan</w:t>
-      </w:r>
-      <w:r>
-        <w:rPr>
-          <w:rFonts w:ascii="Calibri" w:hAnsi="Calibri" w:cs="Calibri"/>
-          <w:sz w:val="22"/>
-          <w:szCs w:val="22"/>
-        </w:rPr>
-        <w:t xml:space="preserve"> and test </w:t>
-      </w:r>
-      <w:r>
-        <w:rPr>
-          <w:rFonts w:ascii="Calibri" w:hAnsi="Calibri" w:cs="Calibri"/>
-          <w:sz w:val="22"/>
-          <w:szCs w:val="22"/>
-        </w:rPr>
-        <w:t>cases</w:t>
-      </w:r>
-      <w:r>
-        <w:rPr>
-          <w:rFonts w:ascii="Calibri" w:hAnsi="Calibri" w:cs="Calibri"/>
-          <w:sz w:val="22"/>
-          <w:szCs w:val="22"/>
-        </w:rPr>
-        <w:t xml:space="preserve"> based on requirement documents and design specifications, making sure edge cases and negative scenarios were covered not just the happy path that developers usually test themselves. </w:t>
-      </w:r>
-    </w:p>
-    <w:p>
-      <w:pPr>
-        <w:pStyle w:val="NoSpacing"/>
-        <w:numPr>
-          <w:ilvl w:val="0"/>
-          <w:numId w:val="7"/>
-        </w:numPr>
-        <w:rPr>
-          <w:rFonts w:ascii="Calibri" w:hAnsi="Calibri" w:cs="Calibri"/>
-          <w:sz w:val="22"/>
-          <w:szCs w:val="22"/>
-        </w:rPr>
-      </w:pPr>
-      <w:r>
-        <w:rPr>
-          <w:rFonts w:ascii="Calibri" w:hAnsi="Calibri" w:cs="Calibri"/>
-          <w:sz w:val="22"/>
-          <w:szCs w:val="22"/>
-        </w:rPr>
         <w:t xml:space="preserve">Worked closely with developers to understand what was being built, reported defects with clear steps to reproduce and supporting screenshots, and retested fixes to confirm the problem was genuinely resolved before marking anything as closed. </w:t>
-      </w:r>
-    </w:p>
-    <w:p>
-      <w:pPr>
-        <w:pStyle w:val="NoSpacing"/>
-        <w:numPr>
-          <w:ilvl w:val="0"/>
-          <w:numId w:val="7"/>
-        </w:numPr>
-        <w:rPr>
-          <w:rFonts w:ascii="Calibri" w:hAnsi="Calibri" w:cs="Calibri"/>
-          <w:sz w:val="22"/>
-          <w:szCs w:val="22"/>
-        </w:rPr>
-      </w:pPr>
-      <w:r>
-        <w:rPr>
-          <w:rFonts w:ascii="Calibri" w:hAnsi="Calibri" w:cs="Calibri"/>
-          <w:sz w:val="22"/>
-          <w:szCs w:val="22"/>
-        </w:rPr>
-        <w:t>Participated in daily standups</w:t>
-      </w:r>
-      <w:r>
-        <w:rPr>
-          <w:rFonts w:ascii="Calibri" w:hAnsi="Calibri" w:cs="Calibri"/>
-          <w:sz w:val="22"/>
-          <w:szCs w:val="22"/>
-        </w:rPr>
-        <w:t>, sprint reviews,</w:t>
-      </w:r>
-      <w:r>
-        <w:rPr>
-          <w:rFonts w:ascii="Calibri" w:hAnsi="Calibri" w:cs="Calibri"/>
-          <w:sz w:val="22"/>
-          <w:szCs w:val="22"/>
-        </w:rPr>
-        <w:t xml:space="preserve"> retrospective</w:t>
-      </w:r>
-      <w:r>
-        <w:rPr>
-          <w:rFonts w:ascii="Calibri" w:hAnsi="Calibri" w:cs="Calibri"/>
-          <w:sz w:val="22"/>
-          <w:szCs w:val="22"/>
-        </w:rPr>
-        <w:t xml:space="preserve"> and team meetings learning how to communicate test progress and quality risks clearly to both technical team members and project managers in a professional setting. </w:t>
-      </w:r>
-    </w:p>
-    <w:p>
-      <w:pPr>
-        <w:pStyle w:val="NoSpacing"/>
-        <w:numPr>
-          <w:ilvl w:val="0"/>
-          <w:numId w:val="7"/>
-        </w:numPr>
-        <w:rPr>
-          <w:rFonts w:ascii="Calibri" w:hAnsi="Calibri" w:cs="Calibri"/>
-          <w:sz w:val="22"/>
-          <w:szCs w:val="22"/>
-        </w:rPr>
-      </w:pPr>
-      <w:r>
-        <w:rPr>
-          <w:rFonts w:ascii="Calibri" w:hAnsi="Calibri" w:cs="Calibri"/>
-          <w:sz w:val="22"/>
-          <w:szCs w:val="22"/>
-        </w:rPr>
-        <w:t>Used this role as a strong foundation to build core testing skills manual testing, test planning, defect management</w:t>
-      </w:r>
-      <w:r>
-        <w:rPr>
-          <w:rFonts w:ascii="Calibri" w:hAnsi="Calibri" w:cs="Calibri"/>
-          <w:sz w:val="22"/>
-          <w:szCs w:val="22"/>
-        </w:rPr>
-        <w:t xml:space="preserve"> </w:t>
-      </w:r>
-      <w:r>
-        <w:rPr>
-          <w:rFonts w:ascii="Calibri" w:hAnsi="Calibri" w:cs="Calibri"/>
-          <w:sz w:val="22"/>
-          <w:szCs w:val="22"/>
-        </w:rPr>
-        <w:t>and working within a real software delivery team which directly shaped the automation and quality engineering career that followed.</w:t>
       </w:r>
     </w:p>
     <w:p>

</xml_diff>